<commit_message>
SoftwareX cover letter: no suggested reviewers
</commit_message>
<xml_diff>
--- a/docs/softwarex/cover_letter.docx
+++ b/docs/softwarex/cover_letter.docx
@@ -149,50 +149,6 @@
     <w:p>
       <w:pPr>
         <w:pStyle w:val="BodyText"/>
-      </w:pPr>
-      <w:r>
-        <w:t xml:space="preserve">Suggested reviewers:</w:t>
-      </w:r>
-    </w:p>
-    <w:p>
-      <w:pPr>
-        <w:pStyle w:val="Compact"/>
-        <w:numPr>
-          <w:ilvl w:val="0"/>
-          <w:numId w:val="1002"/>
-        </w:numPr>
-      </w:pPr>
-      <w:r>
-        <w:t xml:space="preserve">Prof. Hanna Meyer, Institute of Landscape Ecology, University of Münster, Germany. hanna.meyer@uni-muenster.de</w:t>
-      </w:r>
-    </w:p>
-    <w:p>
-      <w:pPr>
-        <w:pStyle w:val="Compact"/>
-        <w:numPr>
-          <w:ilvl w:val="0"/>
-          <w:numId w:val="1002"/>
-        </w:numPr>
-      </w:pPr>
-      <w:r>
-        <w:t xml:space="preserve">Dr Sandro Martinis, German Remote Sensing Data Center, German Aerospace Center (DLR), Germany. Sandro.Martinis@dlr.de</w:t>
-      </w:r>
-    </w:p>
-    <w:p>
-      <w:pPr>
-        <w:pStyle w:val="Compact"/>
-        <w:numPr>
-          <w:ilvl w:val="0"/>
-          <w:numId w:val="1002"/>
-        </w:numPr>
-      </w:pPr>
-      <w:r>
-        <w:t xml:space="preserve">Dr Beth Tellman, Nelson Institute for Environmental Studies, University of Wisconsin–Madison, USA. Beth.tellman@wisc.edu</w:t>
-      </w:r>
-    </w:p>
-    <w:p>
-      <w:pPr>
-        <w:pStyle w:val="FirstParagraph"/>
       </w:pPr>
       <w:r>
         <w:t xml:space="preserve">Thank you for considering the manuscript.</w:t>
@@ -431,9 +387,6 @@
     <w:abstractNumId w:val="990"/>
   </w:num>
   <w:num w:numId="1001">
-    <w:abstractNumId w:val="991"/>
-  </w:num>
-  <w:num w:numId="1002">
     <w:abstractNumId w:val="991"/>
   </w:num>
 </w:numbering>

</xml_diff>

<commit_message>
SoftwareX cover letter as a one-page PDF; letterhead lines kept apart
Built with: pandoc cover_letter.md -o cover_letter.pdf
  -V geometry:top=1.5cm,bottom=1.5cm,left=2cm,right=2cm -V fontsize=11pt
  -V pagestyle=empty -V linestretch=0.96
</commit_message>
<xml_diff>
--- a/docs/softwarex/cover_letter.docx
+++ b/docs/softwarex/cover_letter.docx
@@ -10,19 +10,19 @@
         <w:t xml:space="preserve">Md Rakib Hasan</w:t>
       </w:r>
       <w:r>
-        <w:t xml:space="preserve"> </w:t>
+        <w:br/>
       </w:r>
       <w:r>
         <w:t xml:space="preserve">Department of Soil, Water and Environment, University of Dhaka, Dhaka-1000, Bangladesh</w:t>
       </w:r>
       <w:r>
-        <w:t xml:space="preserve"> </w:t>
+        <w:br/>
       </w:r>
       <w:r>
         <w:t xml:space="preserve">Fermium Systems, Dhaka-1207, Bangladesh</w:t>
       </w:r>
       <w:r>
-        <w:t xml:space="preserve"> </w:t>
+        <w:br/>
       </w:r>
       <w:r>
         <w:t xml:space="preserve">rakibhhridoy@fermium.systems · ORCID 0009-0002-4007-7590</w:t>
@@ -44,7 +44,7 @@
         <w:t xml:space="preserve">The Editors-in-Chief</w:t>
       </w:r>
       <w:r>
-        <w:t xml:space="preserve"> </w:t>
+        <w:br/>
       </w:r>
       <w:r>
         <w:t xml:space="preserve">SoftwareX</w:t>

</xml_diff>

<commit_message>
SoftwareX cover letter: sender details under the signature
The name, affiliations, email and ORCID move from the top to the end, and
the signature drops 'on behalf of both authors'.
</commit_message>
<xml_diff>
--- a/docs/softwarex/cover_letter.docx
+++ b/docs/softwarex/cover_letter.docx
@@ -7,32 +7,6 @@
         <w:pStyle w:val="FirstParagraph"/>
       </w:pPr>
       <w:r>
-        <w:t xml:space="preserve">Md Rakib Hasan</w:t>
-      </w:r>
-      <w:r>
-        <w:br/>
-      </w:r>
-      <w:r>
-        <w:t xml:space="preserve">Department of Soil, Water and Environment, University of Dhaka, Dhaka-1000, Bangladesh</w:t>
-      </w:r>
-      <w:r>
-        <w:br/>
-      </w:r>
-      <w:r>
-        <w:t xml:space="preserve">Fermium Systems, Dhaka-1207, Bangladesh</w:t>
-      </w:r>
-      <w:r>
-        <w:br/>
-      </w:r>
-      <w:r>
-        <w:t xml:space="preserve">rakibhhridoy@fermium.systems · ORCID 0009-0002-4007-7590</w:t>
-      </w:r>
-    </w:p>
-    <w:p>
-      <w:pPr>
-        <w:pStyle w:val="BodyText"/>
-      </w:pPr>
-      <w:r>
         <w:t xml:space="preserve">3 October 2026</w:t>
       </w:r>
     </w:p>
@@ -167,7 +141,25 @@
         <w:pStyle w:val="BodyText"/>
       </w:pPr>
       <w:r>
-        <w:t xml:space="preserve">Md Rakib Hasan, on behalf of both authors</w:t>
+        <w:t xml:space="preserve">Md Rakib Hasan</w:t>
+      </w:r>
+      <w:r>
+        <w:br/>
+      </w:r>
+      <w:r>
+        <w:t xml:space="preserve">Department of Soil, Water and Environment, University of Dhaka, Dhaka-1000, Bangladesh</w:t>
+      </w:r>
+      <w:r>
+        <w:br/>
+      </w:r>
+      <w:r>
+        <w:t xml:space="preserve">Fermium Systems, Dhaka-1207, Bangladesh</w:t>
+      </w:r>
+      <w:r>
+        <w:br/>
+      </w:r>
+      <w:r>
+        <w:t xml:space="preserve">rakibhhridoy@fermium.systems · ORCID 0009-0002-4007-7590</w:t>
       </w:r>
     </w:p>
     <w:sectPr>

</xml_diff>